<commit_message>
Round 2: restructure submission_r2 into a latex_singlefile subfolder
Match the round-1 layout: all LaTeX files (both single-file .tex variants, their
compiled PDFs, the three figures, elsarticle.cls, prletters.sty, elsevier-logo.pdf)
now live under submission_r2/latex_singlefile/, with the other deliverables
(Supplementary_Material.pdf, Graphical_Abstract.pdf, Highlights.docx,
Response_to_Reviewers_R2.docx, Cover_Letter_R2.docx) at the top level.
Regenerated with the corrected bibliography and TruFor footnote.

Co-Authored-By: Claude Opus 4.8 <noreply@anthropic.com>
</commit_message>
<xml_diff>
--- a/paper/submission_r2/Response_to_Reviewers_R2.docx
+++ b/paper/submission_r2/Response_to_Reviewers_R2.docx
@@ -966,31 +966,31 @@
           <w:i w:val="false"/>
           <w:iCs w:val="false"/>
         </w:rPr>
-        <w:t xml:space="preserve">archive. As suggested, we added a brief footnote in Sec. 4.5 noting that per-seed scores</w:t>
-      </w:r>
-    </w:p>
-    <w:p>
-      <w:pPr>
-        <w:spacing w:after="60"/>
-      </w:pPr>
-      <w:r>
-        <w:rPr>
-          <w:i w:val="false"/>
-          <w:iCs w:val="false"/>
-        </w:rPr>
-        <w:t xml:space="preserve">for a TruFor model fine-tuned on FantasyID are released with the code</w:t>
-      </w:r>
-    </w:p>
-    <w:p>
-      <w:pPr>
-        <w:spacing w:after="60"/>
-      </w:pPr>
-      <w:r>
-        <w:rPr>
-          <w:i w:val="false"/>
-          <w:iCs w:val="false"/>
-        </w:rPr>
-        <w:t xml:space="preserve">(</w:t>
+        <w:t xml:space="preserve">archive. As suggested, we added a footnote in Sec. 4.5 noting that a controlled comparison</w:t>
+      </w:r>
+    </w:p>
+    <w:p>
+      <w:pPr>
+        <w:spacing w:after="60"/>
+      </w:pPr>
+      <w:r>
+        <w:rPr>
+          <w:i w:val="false"/>
+          <w:iCs w:val="false"/>
+        </w:rPr>
+        <w:t xml:space="preserve">against a FantasyID-fine-tuned TruFor, evaluated on the same internal holdout, is released</w:t>
+      </w:r>
+    </w:p>
+    <w:p>
+      <w:pPr>
+        <w:spacing w:after="60"/>
+      </w:pPr>
+      <w:r>
+        <w:rPr>
+          <w:i w:val="false"/>
+          <w:iCs w:val="false"/>
+        </w:rPr>
+        <w:t xml:space="preserve">with the code (</w:t>
       </w:r>
       <w:r>
         <w:rPr>
@@ -1005,31 +1005,7 @@
           <w:i w:val="false"/>
           <w:iCs w:val="false"/>
         </w:rPr>
-        <w:t xml:space="preserve">), and explaining that they are kept out of the in-text</w:t>
-      </w:r>
-    </w:p>
-    <w:p>
-      <w:pPr>
-        <w:spacing w:after="60"/>
-      </w:pPr>
-      <w:r>
-        <w:rPr>
-          <w:i w:val="false"/>
-          <w:iCs w:val="false"/>
-        </w:rPr>
-        <w:t xml:space="preserve">comparison because, like the challenge figures, they were not obtained on our internal</w:t>
-      </w:r>
-    </w:p>
-    <w:p>
-      <w:pPr>
-        <w:spacing w:after="60"/>
-      </w:pPr>
-      <w:r>
-        <w:rPr>
-          <w:i w:val="false"/>
-          <w:iCs w:val="false"/>
-        </w:rPr>
-        <w:t xml:space="preserve">holdout, so no controlled comparison is possible.</w:t>
+        <w:t xml:space="preserve">), which improves the completeness of the section.</w:t>
       </w:r>
     </w:p>
     <w:p>
@@ -1058,19 +1034,19 @@
           <w:i w:val="false"/>
           <w:iCs w:val="false"/>
         </w:rPr>
-        <w:t xml:space="preserve"> Sec. 4.5: added a footnote pointing to the released fine-tuned TruFor scores</w:t>
-      </w:r>
-    </w:p>
-    <w:p>
-      <w:pPr>
-        <w:spacing w:after="60"/>
-      </w:pPr>
-      <w:r>
-        <w:rPr>
-          <w:i w:val="false"/>
-          <w:iCs w:val="false"/>
-        </w:rPr>
-        <w:t xml:space="preserve">and explaining their omission from the comparison.</w:t>
+        <w:t xml:space="preserve"> Sec. 4.5: added a footnote pointing to the released fine-tuned-TruFor</w:t>
+      </w:r>
+    </w:p>
+    <w:p>
+      <w:pPr>
+        <w:spacing w:after="60"/>
+      </w:pPr>
+      <w:r>
+        <w:rPr>
+          <w:i w:val="false"/>
+          <w:iCs w:val="false"/>
+        </w:rPr>
+        <w:t xml:space="preserve">controlled comparison.</w:t>
       </w:r>
     </w:p>
     <w:p>

</xml_diff>